<commit_message>
Add 19c patching recommendation placeholder
</commit_message>
<xml_diff>
--- a/resources/templates/edb360_master.docx
+++ b/resources/templates/edb360_master.docx
@@ -17,7 +17,7 @@
           <w:noProof/>
         </w:rPr>
         <w:drawing>
-          <wp:anchor distT="0" distB="0" distL="114300" distR="114300" simplePos="0" relativeHeight="251658240" behindDoc="0" locked="0" layoutInCell="1" allowOverlap="1" wp14:anchorId="54E56719" wp14:editId="0BB39FFD">
+          <wp:anchor distT="0" distB="0" distL="114300" distR="114300" simplePos="0" relativeHeight="251658240" behindDoc="0" locked="0" layoutInCell="1" allowOverlap="1" wp14:anchorId="54E56719" wp14:editId="6DE0335B">
             <wp:simplePos x="0" y="0"/>
             <wp:positionH relativeFrom="margin">
               <wp:posOffset>4230370</wp:posOffset>
@@ -5942,66 +5942,14 @@
             <w:tcW w:w="1667" w:type="pct"/>
           </w:tcPr>
           <w:p>
-            <w:pPr>
-              <w:rPr>
-                <w:rFonts w:ascii="Cambria" w:hAnsi="Cambria"/>
-              </w:rPr>
-            </w:pPr>
-            <w:r>
-              <w:rPr>
-                <w:rFonts w:ascii="Cambria" w:hAnsi="Cambria"/>
-              </w:rPr>
-              <w:lastRenderedPageBreak/>
-              <w:t>{{</w:t>
-            </w:r>
-            <w:proofErr w:type="spellStart"/>
-            <w:r>
-              <w:rPr>
-                <w:rFonts w:ascii="Cambria" w:hAnsi="Cambria"/>
-              </w:rPr>
-              <w:t>recommendation_patching</w:t>
-            </w:r>
-            <w:proofErr w:type="spellEnd"/>
-            <w:r>
-              <w:rPr>
-                <w:rFonts w:ascii="Cambria" w:hAnsi="Cambria"/>
-              </w:rPr>
-              <w:t>}}</w:t>
-            </w:r>
-            <w:r>
-              <w:rPr>
-                <w:rFonts w:ascii="Cambria" w:hAnsi="Cambria"/>
-              </w:rPr>
+            <w:r>
+              <w:t>{{recommendation_patching_19c}}</w:t>
               <w:br/>
-            </w:r>
-            <w:r>
-              <w:rPr>
-                <w:rFonts w:ascii="Cambria" w:hAnsi="Cambria"/>
-              </w:rPr>
-              <w:lastRenderedPageBreak/>
-              <w:t>{{</w:t>
-            </w:r>
-            <w:proofErr w:type="spellStart"/>
-            <w:r>
-              <w:rPr>
-                <w:rFonts w:ascii="Cambria" w:hAnsi="Cambria"/>
-              </w:rPr>
-              <w:t>recommendation_backup</w:t>
-            </w:r>
-            <w:proofErr w:type="spellEnd"/>
-            <w:r>
-              <w:rPr>
-                <w:rFonts w:ascii="Cambria" w:hAnsi="Cambria"/>
-              </w:rPr>
-              <w:t>}}</w:t>
-            </w:r>
-          </w:p>
-          <w:p>
-            <w:pPr>
-              <w:rPr>
-                <w:rFonts w:ascii="Cambria" w:hAnsi="Cambria"/>
-              </w:rPr>
-            </w:pPr>
+              <w:t>{{recommendation_patching}}</w:t>
+              <w:br/>
+              <w:t>{{recommendation_backup}}</w:t>
+              <w:br/>
+            </w:r>
           </w:p>
         </w:tc>
       </w:tr>
@@ -7877,8 +7825,9 @@
         <w:pStyle w:val="ListParagraph"/>
         <w:numPr>
           <w:ilvl w:val="0"/>
-          <w:numId w:val="12"/>
+          <w:numId w:val="11"/>
         </w:numPr>
+        <w:spacing w:before="0"/>
         <w:rPr>
           <w:b/>
         </w:rPr>
@@ -7910,12 +7859,37 @@
           <w:bCs/>
         </w:rPr>
       </w:pPr>
+      <w:proofErr w:type="spellStart"/>
       <w:r>
         <w:rPr>
           <w:b/>
           <w:bCs/>
         </w:rPr>
-        <w:t xml:space="preserve">Đánh giá: </w:t>
+        <w:t>Đánh</w:t>
+      </w:r>
+      <w:proofErr w:type="spellEnd"/>
+      <w:r>
+        <w:rPr>
+          <w:b/>
+          <w:bCs/>
+        </w:rPr>
+        <w:t xml:space="preserve"> </w:t>
+      </w:r>
+      <w:proofErr w:type="spellStart"/>
+      <w:r>
+        <w:rPr>
+          <w:b/>
+          <w:bCs/>
+        </w:rPr>
+        <w:t>giá</w:t>
+      </w:r>
+      <w:proofErr w:type="spellEnd"/>
+      <w:r>
+        <w:rPr>
+          <w:b/>
+          <w:bCs/>
+        </w:rPr>
+        <w:t xml:space="preserve">: </w:t>
       </w:r>
     </w:p>
     <w:p>
@@ -9849,6 +9823,14 @@
       <w:proofErr w:type="spellEnd"/>
       <w:r>
         <w:t>}}</w:t>
+      </w:r>
+    </w:p>
+    <w:p>
+      <w:pPr>
+        <w:pStyle w:val="ListParagraph"/>
+      </w:pPr>
+      <w:r>
+        <w:t>{{recommendation_patching_19c}}</w:t>
       </w:r>
     </w:p>
     <w:p>
@@ -10392,7 +10374,7 @@
         <v:path o:extrusionok="f" gradientshapeok="t" o:connecttype="rect"/>
         <o:lock v:ext="edit" aspectratio="t"/>
       </v:shapetype>
-      <v:shape id="0" o:spid="_x0000_i1025" type="#_x0000_t75" style="width:11.4pt;height:11.4pt" o:bullet="t">
+      <v:shape id="0" o:spid="_x0000_i1025" type="#_x0000_t75" style="width:11.25pt;height:11.25pt" o:bullet="t">
         <v:imagedata r:id="rId1" o:title=""/>
       </v:shape>
     </w:pict>

</xml_diff>

<commit_message>
Fix Data Guard parameters rendering
</commit_message>
<xml_diff>
--- a/resources/templates/edb360_master.docx
+++ b/resources/templates/edb360_master.docx
@@ -17,7 +17,7 @@
           <w:noProof/>
         </w:rPr>
         <w:drawing>
-          <wp:anchor distT="0" distB="0" distL="114300" distR="114300" simplePos="0" relativeHeight="251658240" behindDoc="0" locked="0" layoutInCell="1" allowOverlap="1" wp14:anchorId="54E56719" wp14:editId="6DE0335B">
+          <wp:anchor distT="0" distB="0" distL="114300" distR="114300" simplePos="0" relativeHeight="251658240" behindDoc="0" locked="0" layoutInCell="1" allowOverlap="1" wp14:anchorId="54E56719" wp14:editId="4FB63247">
             <wp:simplePos x="0" y="0"/>
             <wp:positionH relativeFrom="margin">
               <wp:posOffset>4230370</wp:posOffset>
@@ -5943,11 +5943,22 @@
           </w:tcPr>
           <w:p>
             <w:r>
+              <w:lastRenderedPageBreak/>
               <w:t>{{recommendation_patching_19c}}</w:t>
+            </w:r>
+            <w:r>
               <w:br/>
-              <w:t>{{recommendation_patching}}</w:t>
+              <w:t>{{recommendation_patching}</w:t>
+            </w:r>
+            <w:r>
+              <w:lastRenderedPageBreak/>
+              <w:t>}</w:t>
+            </w:r>
+            <w:r>
               <w:br/>
               <w:t>{{recommendation_backup}}</w:t>
+            </w:r>
+            <w:r>
               <w:br/>
             </w:r>
           </w:p>
@@ -7096,6 +7107,12 @@
       <w:bookmarkEnd w:id="32"/>
     </w:p>
     <w:p>
+      <w:pPr/>
+      <w:r>
+        <w:t>&lt;data_guard_parameters&gt;</w:t>
+      </w:r>
+    </w:p>
+    <w:p>
       <w:pPr>
         <w:rPr>
           <w:rFonts w:cs="Arial"/>
@@ -8572,82 +8589,93 @@
       </w:r>
     </w:p>
     <w:p>
+      <w:pPr>
+        <w:rPr>
+          <w:iCs/>
+        </w:rPr>
+      </w:pPr>
+    </w:p>
+    <w:p>
+      <w:pPr>
+        <w:pStyle w:val="ListParagraph"/>
+        <w:numPr>
+          <w:ilvl w:val="0"/>
+          <w:numId w:val="12"/>
+        </w:numPr>
+        <w:rPr>
+          <w:b/>
+        </w:rPr>
+      </w:pPr>
+      <w:r>
+        <w:rPr>
+          <w:b/>
+        </w:rPr>
+        <w:t xml:space="preserve">Các </w:t>
+      </w:r>
+      <w:proofErr w:type="spellStart"/>
+      <w:r>
+        <w:rPr>
+          <w:b/>
+        </w:rPr>
+        <w:t>câu</w:t>
+      </w:r>
+      <w:proofErr w:type="spellEnd"/>
+      <w:r>
+        <w:rPr>
+          <w:b/>
+        </w:rPr>
+        <w:t xml:space="preserve"> </w:t>
+      </w:r>
+      <w:proofErr w:type="spellStart"/>
+      <w:r>
+        <w:rPr>
+          <w:b/>
+        </w:rPr>
+        <w:t>lệnh</w:t>
+      </w:r>
+      <w:proofErr w:type="spellEnd"/>
+      <w:r>
+        <w:rPr>
+          <w:b/>
+        </w:rPr>
+        <w:t xml:space="preserve"> </w:t>
+      </w:r>
+      <w:proofErr w:type="spellStart"/>
+      <w:r>
+        <w:rPr>
+          <w:b/>
+        </w:rPr>
+        <w:t>tốn</w:t>
+      </w:r>
+      <w:proofErr w:type="spellEnd"/>
+      <w:r>
+        <w:rPr>
+          <w:b/>
+        </w:rPr>
+        <w:t xml:space="preserve"> </w:t>
+      </w:r>
+      <w:proofErr w:type="spellStart"/>
+      <w:r>
+        <w:rPr>
+          <w:b/>
+        </w:rPr>
+        <w:t>nhiều</w:t>
+      </w:r>
+      <w:proofErr w:type="spellEnd"/>
+      <w:r>
+        <w:rPr>
+          <w:b/>
+        </w:rPr>
+        <w:t xml:space="preserve"> DB Time</w:t>
+      </w:r>
+    </w:p>
+    <w:p>
       <w:r>
         <w:t>{{table_ash_top_sql_cluster_9_days}}</w:t>
       </w:r>
     </w:p>
     <w:p/>
     <w:bookmarkEnd w:id="54"/>
-    <w:p>
-      <w:pPr>
-        <w:jc w:val="center"/>
-        <w:rPr>
-          <w:iCs/>
-        </w:rPr>
-      </w:pPr>
-      <w:r>
-        <w:rPr>
-          <w:iCs/>
-        </w:rPr>
-        <w:t xml:space="preserve">Các </w:t>
-      </w:r>
-      <w:proofErr w:type="spellStart"/>
-      <w:r>
-        <w:rPr>
-          <w:iCs/>
-        </w:rPr>
-        <w:t>câu</w:t>
-      </w:r>
-      <w:proofErr w:type="spellEnd"/>
-      <w:r>
-        <w:rPr>
-          <w:iCs/>
-        </w:rPr>
-        <w:t xml:space="preserve"> </w:t>
-      </w:r>
-      <w:proofErr w:type="spellStart"/>
-      <w:r>
-        <w:rPr>
-          <w:iCs/>
-        </w:rPr>
-        <w:t>lệnh</w:t>
-      </w:r>
-      <w:proofErr w:type="spellEnd"/>
-      <w:r>
-        <w:rPr>
-          <w:iCs/>
-        </w:rPr>
-        <w:t xml:space="preserve"> </w:t>
-      </w:r>
-      <w:proofErr w:type="spellStart"/>
-      <w:r>
-        <w:rPr>
-          <w:iCs/>
-        </w:rPr>
-        <w:t>tốn</w:t>
-      </w:r>
-      <w:proofErr w:type="spellEnd"/>
-      <w:r>
-        <w:rPr>
-          <w:iCs/>
-        </w:rPr>
-        <w:t xml:space="preserve"> </w:t>
-      </w:r>
-      <w:proofErr w:type="spellStart"/>
-      <w:r>
-        <w:rPr>
-          <w:iCs/>
-        </w:rPr>
-        <w:t>nhiều</w:t>
-      </w:r>
-      <w:proofErr w:type="spellEnd"/>
-      <w:r>
-        <w:rPr>
-          <w:iCs/>
-        </w:rPr>
-        <w:t xml:space="preserve"> DB Time</w:t>
-      </w:r>
-    </w:p>
     <w:p>
       <w:pPr>
         <w:jc w:val="center"/>
@@ -10374,7 +10402,7 @@
         <v:path o:extrusionok="f" gradientshapeok="t" o:connecttype="rect"/>
         <o:lock v:ext="edit" aspectratio="t"/>
       </v:shapetype>
-      <v:shape id="0" o:spid="_x0000_i1025" type="#_x0000_t75" style="width:11.25pt;height:11.25pt" o:bullet="t">
+      <v:shape id="0" o:spid="_x0000_i1025" type="#_x0000_t75" style="width:11.3pt;height:11.3pt" o:bullet="t">
         <v:imagedata r:id="rId1" o:title=""/>
       </v:shape>
     </w:pict>

</xml_diff>